<commit_message>
Section numbering now comes from the template's own list
The five mandatory sections and their subsections are attached to the
template's multilevel list (numId 1: "%1." at level 0, "%1.%2." at level 1),
so Word generates 1., 2., 2.1. itself. Previously the numbers were typed into
the heading text, which would have been duplicated by the list on any edit and
did not match how the template is built. In-text cross-references (Section 3,
3.2, 3.3) were checked against the generated numbers.

The metadata table's description column is now asserted equal to the
template's, row for row, and every C1-C8 value is asserted non-empty.

examples/: build_docx.py and build_docx_supp.py added, so the submission
documents can be regenerated from the markdown sources in paper/.
</commit_message>
<xml_diff>
--- a/paper/submission/EmbedResearchGaps_SoftwareX.docx
+++ b/paper/submission/EmbedResearchGaps_SoftwareX.docx
@@ -953,9 +953,13 @@
     <w:p>
       <w:pPr>
         <w:pStyle w:val="Heading1"/>
-      </w:pPr>
-      <w:r>
-        <w:t>1. Motivation and significance</w:t>
+        <w:numPr>
+          <w:ilvl w:val="0"/>
+          <w:numId w:val="1"/>
+        </w:numPr>
+      </w:pPr>
+      <w:r>
+        <w:t>Motivation and significance</w:t>
       </w:r>
     </w:p>
     <w:p>
@@ -1019,17 +1023,25 @@
     <w:p>
       <w:pPr>
         <w:pStyle w:val="Heading1"/>
-      </w:pPr>
-      <w:r>
-        <w:t>2. Software description</w:t>
+        <w:numPr>
+          <w:ilvl w:val="0"/>
+          <w:numId w:val="1"/>
+        </w:numPr>
+      </w:pPr>
+      <w:r>
+        <w:t>Software description</w:t>
       </w:r>
     </w:p>
     <w:p>
       <w:pPr>
         <w:pStyle w:val="Heading2"/>
-      </w:pPr>
-      <w:r>
-        <w:t>2.1. Software architecture</w:t>
+        <w:numPr>
+          <w:ilvl w:val="1"/>
+          <w:numId w:val="1"/>
+        </w:numPr>
+      </w:pPr>
+      <w:r>
+        <w:t>Software architecture</w:t>
       </w:r>
     </w:p>
     <w:p>
@@ -1210,9 +1222,13 @@
     <w:p>
       <w:pPr>
         <w:pStyle w:val="Heading2"/>
-      </w:pPr>
-      <w:r>
-        <w:t>2.2. Software functionalities</w:t>
+        <w:numPr>
+          <w:ilvl w:val="1"/>
+          <w:numId w:val="1"/>
+        </w:numPr>
+      </w:pPr>
+      <w:r>
+        <w:t>Software functionalities</w:t>
       </w:r>
     </w:p>
     <w:p>
@@ -1584,9 +1600,13 @@
     <w:p>
       <w:pPr>
         <w:pStyle w:val="Heading1"/>
-      </w:pPr>
-      <w:r>
-        <w:t>3. Illustrative examples</w:t>
+        <w:numPr>
+          <w:ilvl w:val="0"/>
+          <w:numId w:val="1"/>
+        </w:numPr>
+      </w:pPr>
+      <w:r>
+        <w:t>Illustrative examples</w:t>
       </w:r>
     </w:p>
     <w:p>
@@ -1679,9 +1699,13 @@
     <w:p>
       <w:pPr>
         <w:pStyle w:val="Heading2"/>
-      </w:pPr>
-      <w:r>
-        <w:t>3.1. What the modes return</w:t>
+        <w:numPr>
+          <w:ilvl w:val="1"/>
+          <w:numId w:val="1"/>
+        </w:numPr>
+      </w:pPr>
+      <w:r>
+        <w:t>What the modes return</w:t>
       </w:r>
     </w:p>
     <w:p>
@@ -1997,9 +2021,13 @@
     <w:p>
       <w:pPr>
         <w:pStyle w:val="Heading2"/>
-      </w:pPr>
-      <w:r>
-        <w:t>3.2. How stable the candidate lists are</w:t>
+        <w:numPr>
+          <w:ilvl w:val="1"/>
+          <w:numId w:val="1"/>
+        </w:numPr>
+      </w:pPr>
+      <w:r>
+        <w:t>How stable the candidate lists are</w:t>
       </w:r>
     </w:p>
     <w:p>
@@ -2147,9 +2175,13 @@
     <w:p>
       <w:pPr>
         <w:pStyle w:val="Heading2"/>
-      </w:pPr>
-      <w:r>
-        <w:t>3.3. What the panel says</w:t>
+        <w:numPr>
+          <w:ilvl w:val="1"/>
+          <w:numId w:val="1"/>
+        </w:numPr>
+      </w:pPr>
+      <w:r>
+        <w:t>What the panel says</w:t>
       </w:r>
     </w:p>
     <w:p>
@@ -2395,9 +2427,13 @@
     <w:p>
       <w:pPr>
         <w:pStyle w:val="Heading1"/>
-      </w:pPr>
-      <w:r>
-        <w:t>4. Impact</w:t>
+        <w:numPr>
+          <w:ilvl w:val="0"/>
+          <w:numId w:val="1"/>
+        </w:numPr>
+      </w:pPr>
+      <w:r>
+        <w:t>Impact</w:t>
       </w:r>
     </w:p>
     <w:p>
@@ -2474,9 +2510,13 @@
     <w:p>
       <w:pPr>
         <w:pStyle w:val="Heading1"/>
-      </w:pPr>
-      <w:r>
-        <w:t>5. Conclusions</w:t>
+        <w:numPr>
+          <w:ilvl w:val="0"/>
+          <w:numId w:val="1"/>
+        </w:numPr>
+      </w:pPr>
+      <w:r>
+        <w:t>Conclusions</w:t>
       </w:r>
     </w:p>
     <w:p>

</xml_diff>